<commit_message>
downloads: restructure 'Inspection Templates' to 'Factory Assessment', move between Whitepapers and Inspection Template, add Anti-Bribery Pledge file
</commit_message>
<xml_diff>
--- a/downloads/inspection-report-template-general.docx
+++ b/downloads/inspection-report-template-general.docx
@@ -597,14 +597,7 @@
               <w:rPr>
                 <w:rFonts w:ascii="Arial" w:hAnsi="Arial" w:cs="Arial"/>
               </w:rPr>
-              <w:t xml:space="preserve"> / </w:t>
-            </w:r>
-            <w:proofErr w:type="gramStart"/>
-            <w:r>
-              <w:rPr>
-                <w:rFonts w:ascii="Arial" w:hAnsi="Arial" w:cs="Arial"/>
-              </w:rPr>
-              <w:t>CTN</w:t>
+              <w:t xml:space="preserve"> / CTN</w:t>
             </w:r>
             <w:r>
               <w:rPr>
@@ -612,7 +605,6 @@
               </w:rPr>
               <w:t>s :</w:t>
             </w:r>
-            <w:proofErr w:type="gramEnd"/>
           </w:p>
         </w:tc>
         <w:tc>
@@ -1368,18 +1360,10 @@
             <w:bookmarkStart w:id="0" w:name="_Inspection_Result_"/>
             <w:bookmarkEnd w:id="0"/>
             <w:r>
-              <w:t xml:space="preserve">Inspection </w:t>
-            </w:r>
-            <w:proofErr w:type="gramStart"/>
-            <w:r>
-              <w:t xml:space="preserve">Result </w:t>
-            </w:r>
-            <w:r>
-              <w:t xml:space="preserve"> Breakdown</w:t>
-            </w:r>
-            <w:proofErr w:type="gramEnd"/>
-            <w:r>
-              <w:t xml:space="preserve"> Summary:</w:t>
+              <w:t xml:space="preserve">Inspection Result </w:t>
+            </w:r>
+            <w:r>
+              <w:t xml:space="preserve"> Breakdown Summary:</w:t>
             </w:r>
           </w:p>
         </w:tc>
@@ -2125,94 +2109,6 @@
                 <w:lang w:eastAsia="zh-CN"/>
               </w:rPr>
             </w:pPr>
-            <w:r>
-              <w:rPr>
-                <w:rFonts w:ascii="Arial" w:hAnsi="Arial" w:cs="Arial" w:hint="eastAsia"/>
-                <w:color w:val="EE0000"/>
-                <w:lang w:eastAsia="zh-CN"/>
-              </w:rPr>
-              <w:t>凡是</w:t>
-            </w:r>
-            <w:r>
-              <w:rPr>
-                <w:rFonts w:ascii="Arial" w:hAnsi="Arial" w:cs="Arial" w:hint="eastAsia"/>
-                <w:color w:val="EE0000"/>
-                <w:lang w:eastAsia="zh-CN"/>
-              </w:rPr>
-              <w:t xml:space="preserve"> Fail </w:t>
-            </w:r>
-            <w:r>
-              <w:rPr>
-                <w:rFonts w:ascii="Arial" w:hAnsi="Arial" w:cs="Arial" w:hint="eastAsia"/>
-                <w:color w:val="EE0000"/>
-                <w:lang w:eastAsia="zh-CN"/>
-              </w:rPr>
-              <w:t>或</w:t>
-            </w:r>
-            <w:r>
-              <w:rPr>
-                <w:rFonts w:ascii="Arial" w:hAnsi="Arial" w:cs="Arial" w:hint="eastAsia"/>
-                <w:color w:val="EE0000"/>
-                <w:lang w:eastAsia="zh-CN"/>
-              </w:rPr>
-              <w:t xml:space="preserve"> Pending</w:t>
-            </w:r>
-            <w:r>
-              <w:rPr>
-                <w:rFonts w:ascii="Arial" w:hAnsi="Arial" w:cs="Arial" w:hint="eastAsia"/>
-                <w:color w:val="EE0000"/>
-                <w:lang w:eastAsia="zh-CN"/>
-              </w:rPr>
-              <w:t>的，</w:t>
-            </w:r>
-            <w:r>
-              <w:rPr>
-                <w:rFonts w:ascii="Arial" w:hAnsi="Arial" w:cs="Arial" w:hint="eastAsia"/>
-                <w:color w:val="EE0000"/>
-                <w:lang w:eastAsia="zh-CN"/>
-              </w:rPr>
-              <w:t xml:space="preserve"> </w:t>
-            </w:r>
-            <w:r>
-              <w:rPr>
-                <w:rFonts w:ascii="Arial" w:hAnsi="Arial" w:cs="Arial" w:hint="eastAsia"/>
-                <w:color w:val="EE0000"/>
-                <w:lang w:eastAsia="zh-CN"/>
-              </w:rPr>
-              <w:t>请描红字体，</w:t>
-            </w:r>
-            <w:r>
-              <w:rPr>
-                <w:rFonts w:ascii="Arial" w:hAnsi="Arial" w:cs="Arial" w:hint="eastAsia"/>
-                <w:color w:val="EE0000"/>
-                <w:lang w:eastAsia="zh-CN"/>
-              </w:rPr>
-              <w:t xml:space="preserve">  Pass</w:t>
-            </w:r>
-            <w:r>
-              <w:rPr>
-                <w:rFonts w:ascii="Arial" w:hAnsi="Arial" w:cs="Arial" w:hint="eastAsia"/>
-                <w:color w:val="EE0000"/>
-                <w:lang w:eastAsia="zh-CN"/>
-              </w:rPr>
-              <w:t>的保持黑色就行，</w:t>
-            </w:r>
-            <w:r>
-              <w:rPr>
-                <w:rFonts w:ascii="Arial" w:hAnsi="Arial" w:cs="Arial" w:hint="eastAsia"/>
-                <w:color w:val="EE0000"/>
-                <w:lang w:eastAsia="zh-CN"/>
-              </w:rPr>
-              <w:t xml:space="preserve"> </w:t>
-            </w:r>
-            <w:r>
-              <w:rPr>
-                <w:rFonts w:ascii="Arial" w:hAnsi="Arial" w:cs="Arial" w:hint="eastAsia"/>
-                <w:color w:val="EE0000"/>
-                <w:lang w:eastAsia="zh-CN"/>
-              </w:rPr>
-              <w:t>谢谢！</w:t>
-            </w:r>
           </w:p>
         </w:tc>
       </w:tr>
@@ -4848,9 +4744,8 @@
                 <w:sz w:val="20"/>
                 <w:szCs w:val="20"/>
               </w:rPr>
-              <w:t xml:space="preserve">Randomly </w:t>
-            </w:r>
-            <w:proofErr w:type="gramStart"/>
+              <w:t>Randomly select</w:t>
+            </w:r>
             <w:r>
               <w:rPr>
                 <w:rFonts w:ascii="Arial" w:hAnsi="Arial" w:cs="Arial"/>
@@ -4858,7 +4753,7 @@
                 <w:sz w:val="20"/>
                 <w:szCs w:val="20"/>
               </w:rPr>
-              <w:t>select</w:t>
+              <w:t>ed</w:t>
             </w:r>
             <w:r>
               <w:rPr>
@@ -4867,7 +4762,16 @@
                 <w:sz w:val="20"/>
                 <w:szCs w:val="20"/>
               </w:rPr>
-              <w:t>ed</w:t>
+              <w:t xml:space="preserve"> </w:t>
+            </w:r>
+            <w:r>
+              <w:rPr>
+                <w:rFonts w:ascii="Arial" w:hAnsi="Arial" w:cs="Arial"/>
+                <w:color w:val="FF0000"/>
+                <w:sz w:val="20"/>
+                <w:szCs w:val="20"/>
+              </w:rPr>
+              <w:t>?</w:t>
             </w:r>
             <w:r>
               <w:rPr>
@@ -4876,7 +4780,7 @@
                 <w:sz w:val="20"/>
                 <w:szCs w:val="20"/>
               </w:rPr>
-              <w:t xml:space="preserve"> </w:t>
+              <w:t xml:space="preserve"> CTNs, inspected carton NO.: </w:t>
             </w:r>
             <w:r>
               <w:rPr>
@@ -4887,36 +4791,6 @@
               </w:rPr>
               <w:t>?</w:t>
             </w:r>
-            <w:proofErr w:type="gramEnd"/>
-            <w:r>
-              <w:rPr>
-                <w:rFonts w:ascii="Arial" w:hAnsi="Arial" w:cs="Arial"/>
-                <w:color w:val="auto"/>
-                <w:sz w:val="20"/>
-                <w:szCs w:val="20"/>
-              </w:rPr>
-              <w:t xml:space="preserve"> CTNs, inspected carton NO.</w:t>
-            </w:r>
-            <w:proofErr w:type="gramStart"/>
-            <w:r>
-              <w:rPr>
-                <w:rFonts w:ascii="Arial" w:hAnsi="Arial" w:cs="Arial"/>
-                <w:color w:val="auto"/>
-                <w:sz w:val="20"/>
-                <w:szCs w:val="20"/>
-              </w:rPr>
-              <w:t xml:space="preserve">: </w:t>
-            </w:r>
-            <w:r>
-              <w:rPr>
-                <w:rFonts w:ascii="Arial" w:hAnsi="Arial" w:cs="Arial"/>
-                <w:color w:val="FF0000"/>
-                <w:sz w:val="20"/>
-                <w:szCs w:val="20"/>
-              </w:rPr>
-              <w:t>?</w:t>
-            </w:r>
-            <w:proofErr w:type="gramEnd"/>
           </w:p>
         </w:tc>
       </w:tr>
@@ -10465,25 +10339,7 @@
                 <w:sz w:val="20"/>
                 <w:lang w:val="en-US" w:eastAsia="zh-CN"/>
               </w:rPr>
-              <w:t xml:space="preserve">Carton </w:t>
-            </w:r>
-            <w:proofErr w:type="gramStart"/>
-            <w:r>
-              <w:rPr>
-                <w:rFonts w:ascii="Arial" w:hAnsi="Arial" w:cs="Arial"/>
-                <w:sz w:val="20"/>
-                <w:lang w:val="en-US" w:eastAsia="zh-CN"/>
-              </w:rPr>
-              <w:t>drop</w:t>
-            </w:r>
-            <w:proofErr w:type="gramEnd"/>
-            <w:r>
-              <w:rPr>
-                <w:rFonts w:ascii="Arial" w:hAnsi="Arial" w:cs="Arial"/>
-                <w:sz w:val="20"/>
-                <w:lang w:val="en-US" w:eastAsia="zh-CN"/>
-              </w:rPr>
-              <w:t xml:space="preserve"> test</w:t>
+              <w:t>Carton drop test</w:t>
             </w:r>
           </w:p>
         </w:tc>
@@ -11906,25 +11762,7 @@
                 <w:sz w:val="20"/>
                 <w:lang w:val="en-US" w:eastAsia="zh-CN"/>
               </w:rPr>
-              <w:t xml:space="preserve">Seam </w:t>
-            </w:r>
-            <w:proofErr w:type="gramStart"/>
-            <w:r>
-              <w:rPr>
-                <w:rFonts w:ascii="Arial" w:hAnsi="Arial" w:cs="Arial"/>
-                <w:sz w:val="20"/>
-                <w:lang w:val="en-US" w:eastAsia="zh-CN"/>
-              </w:rPr>
-              <w:t>pull</w:t>
-            </w:r>
-            <w:proofErr w:type="gramEnd"/>
-            <w:r>
-              <w:rPr>
-                <w:rFonts w:ascii="Arial" w:hAnsi="Arial" w:cs="Arial"/>
-                <w:sz w:val="20"/>
-                <w:lang w:val="en-US" w:eastAsia="zh-CN"/>
-              </w:rPr>
-              <w:t xml:space="preserve"> by hand</w:t>
+              <w:t>Seam pull by hand</w:t>
             </w:r>
           </w:p>
         </w:tc>
@@ -13729,23 +13567,13 @@
                 <w:lang w:val="en-US" w:eastAsia="zh-CN"/>
               </w:rPr>
             </w:pPr>
-            <w:proofErr w:type="gramStart"/>
             <w:r>
               <w:rPr>
                 <w:rFonts w:ascii="Arial" w:hAnsi="Arial" w:cs="Arial"/>
                 <w:sz w:val="20"/>
                 <w:lang w:val="en-US" w:eastAsia="zh-CN"/>
               </w:rPr>
-              <w:t>Other</w:t>
-            </w:r>
-            <w:proofErr w:type="gramEnd"/>
-            <w:r>
-              <w:rPr>
-                <w:rFonts w:ascii="Arial" w:hAnsi="Arial" w:cs="Arial"/>
-                <w:sz w:val="20"/>
-                <w:lang w:val="en-US" w:eastAsia="zh-CN"/>
-              </w:rPr>
-              <w:t xml:space="preserve"> test?</w:t>
+              <w:t>Other test?</w:t>
             </w:r>
           </w:p>
         </w:tc>
@@ -13940,98 +13768,6 @@
                 <w:lang w:eastAsia="zh-CN"/>
               </w:rPr>
               <w:t>S</w:t>
-            </w:r>
-          </w:p>
-        </w:tc>
-      </w:tr>
-      <w:tr>
-        <w:tblPrEx>
-          <w:shd w:val="clear" w:color="auto" w:fill="FF9900"/>
-        </w:tblPrEx>
-        <w:trPr>
-          <w:trHeight w:val="284"/>
-        </w:trPr>
-        <w:tc>
-          <w:tcPr>
-            <w:tcW w:w="10800" w:type="dxa"/>
-            <w:gridSpan w:val="2"/>
-            <w:vAlign w:val="center"/>
-          </w:tcPr>
-          <w:p>
-            <w:pPr>
-              <w:pStyle w:val="Header"/>
-              <w:jc w:val="center"/>
-              <w:rPr>
-                <w:rFonts w:ascii="Arial" w:eastAsia="等线" w:hAnsi="Arial" w:cs="Arial"/>
-                <w:color w:val="000000"/>
-                <w:sz w:val="20"/>
-                <w:lang w:eastAsia="zh-CN"/>
-              </w:rPr>
-            </w:pPr>
-            <w:r>
-              <w:rPr>
-                <w:rFonts w:ascii="Arial" w:hAnsi="Arial" w:cs="Arial"/>
-                <w:sz w:val="18"/>
-                <w:lang w:eastAsia="zh-CN"/>
-              </w:rPr>
-              <w:t xml:space="preserve"> </w:t>
-            </w:r>
-            <w:r>
-              <w:rPr>
-                <w:rFonts w:ascii="Arial" w:eastAsia="等线" w:hAnsi="Arial" w:cs="Arial"/>
-                <w:color w:val="000000"/>
-                <w:sz w:val="20"/>
-                <w:highlight w:val="yellow"/>
-                <w:lang w:eastAsia="zh-CN"/>
-              </w:rPr>
-              <w:t>只有测试图片</w:t>
-            </w:r>
-            <w:r>
-              <w:rPr>
-                <w:rFonts w:ascii="Arial" w:eastAsia="等线" w:hAnsi="Arial" w:cs="Arial"/>
-                <w:color w:val="000000"/>
-                <w:sz w:val="20"/>
-                <w:highlight w:val="yellow"/>
-                <w:lang w:eastAsia="zh-CN"/>
-              </w:rPr>
-              <w:t xml:space="preserve"> </w:t>
-            </w:r>
-            <w:r>
-              <w:rPr>
-                <w:rFonts w:ascii="Arial" w:eastAsia="等线" w:hAnsi="Arial" w:cs="Arial"/>
-                <w:color w:val="000000"/>
-                <w:sz w:val="20"/>
-                <w:highlight w:val="yellow"/>
-                <w:lang w:eastAsia="zh-CN"/>
-              </w:rPr>
-              <w:t>需要描述</w:t>
-            </w:r>
-            <w:r>
-              <w:rPr>
-                <w:rFonts w:ascii="Arial" w:eastAsia="等线" w:hAnsi="Arial" w:cs="Arial" w:hint="eastAsia"/>
-                <w:color w:val="000000"/>
-                <w:sz w:val="20"/>
-                <w:lang w:eastAsia="zh-CN"/>
-              </w:rPr>
-              <w:t xml:space="preserve">   </w:t>
-            </w:r>
-            <w:r>
-              <w:rPr>
-                <w:rFonts w:ascii="Arial" w:eastAsia="等线" w:hAnsi="Arial" w:cs="Arial" w:hint="eastAsia"/>
-                <w:color w:val="EE0000"/>
-                <w:sz w:val="20"/>
-                <w:lang w:eastAsia="zh-CN"/>
-              </w:rPr>
-              <w:t xml:space="preserve">Loading test </w:t>
-            </w:r>
-            <w:r>
-              <w:rPr>
-                <w:rFonts w:ascii="Arial" w:eastAsia="等线" w:hAnsi="Arial" w:cs="Arial" w:hint="eastAsia"/>
-                <w:color w:val="EE0000"/>
-                <w:sz w:val="20"/>
-                <w:lang w:eastAsia="zh-CN"/>
-              </w:rPr>
-              <w:t>要写明重量</w:t>
             </w:r>
           </w:p>
         </w:tc>
@@ -18840,14 +18576,7 @@
         <w:rFonts w:hint="eastAsia"/>
         <w:lang w:eastAsia="zh-CN"/>
       </w:rPr>
-      <w:t xml:space="preserve">2015 </w:t>
-    </w:r>
-    <w:r>
-      <w:rPr>
-        <w:rFonts w:hint="eastAsia"/>
-        <w:lang w:eastAsia="zh-CN"/>
-      </w:rPr>
-      <w:t>Version</w:t>
+      <w:t>2015 Version</w:t>
     </w:r>
   </w:p>
   <w:p>
@@ -25320,6 +25049,7 @@
     <w:rsid w:val="00057DFF"/>
     <w:rsid w:val="00126AE8"/>
     <w:rsid w:val="001432C8"/>
+    <w:rsid w:val="00163832"/>
     <w:rsid w:val="001F1A60"/>
     <w:rsid w:val="00285E2F"/>
     <w:rsid w:val="00344966"/>
@@ -25338,6 +25068,7 @@
     <w:rsid w:val="006A0F3E"/>
     <w:rsid w:val="00761851"/>
     <w:rsid w:val="007A5DC5"/>
+    <w:rsid w:val="007A796C"/>
     <w:rsid w:val="00822B44"/>
     <w:rsid w:val="008E18F2"/>
     <w:rsid w:val="008E6244"/>

</xml_diff>

<commit_message>
feat: new inspection case - Acacia Wood Salad Tray Spliced Color Difference PSI
</commit_message>
<xml_diff>
--- a/downloads/inspection-report-template-general.docx
+++ b/downloads/inspection-report-template-general.docx
@@ -597,7 +597,14 @@
               <w:rPr>
                 <w:rFonts w:ascii="Arial" w:hAnsi="Arial" w:cs="Arial"/>
               </w:rPr>
-              <w:t xml:space="preserve"> / CTN</w:t>
+              <w:t xml:space="preserve"> / </w:t>
+            </w:r>
+            <w:proofErr w:type="gramStart"/>
+            <w:r>
+              <w:rPr>
+                <w:rFonts w:ascii="Arial" w:hAnsi="Arial" w:cs="Arial"/>
+              </w:rPr>
+              <w:t>CTN</w:t>
             </w:r>
             <w:r>
               <w:rPr>
@@ -605,6 +612,7 @@
               </w:rPr>
               <w:t>s :</w:t>
             </w:r>
+            <w:proofErr w:type="gramEnd"/>
           </w:p>
         </w:tc>
         <w:tc>
@@ -1360,10 +1368,18 @@
             <w:bookmarkStart w:id="0" w:name="_Inspection_Result_"/>
             <w:bookmarkEnd w:id="0"/>
             <w:r>
-              <w:t xml:space="preserve">Inspection Result </w:t>
-            </w:r>
-            <w:r>
-              <w:t xml:space="preserve"> Breakdown Summary:</w:t>
+              <w:t xml:space="preserve">Inspection </w:t>
+            </w:r>
+            <w:proofErr w:type="gramStart"/>
+            <w:r>
+              <w:t xml:space="preserve">Result </w:t>
+            </w:r>
+            <w:r>
+              <w:t xml:space="preserve"> Breakdown</w:t>
+            </w:r>
+            <w:proofErr w:type="gramEnd"/>
+            <w:r>
+              <w:t xml:space="preserve"> Summary:</w:t>
             </w:r>
           </w:p>
         </w:tc>
@@ -4744,8 +4760,9 @@
                 <w:sz w:val="20"/>
                 <w:szCs w:val="20"/>
               </w:rPr>
-              <w:t>Randomly select</w:t>
-            </w:r>
+              <w:t xml:space="preserve">Randomly </w:t>
+            </w:r>
+            <w:proofErr w:type="gramStart"/>
             <w:r>
               <w:rPr>
                 <w:rFonts w:ascii="Arial" w:hAnsi="Arial" w:cs="Arial"/>
@@ -4753,6 +4770,15 @@
                 <w:sz w:val="20"/>
                 <w:szCs w:val="20"/>
               </w:rPr>
+              <w:t>select</w:t>
+            </w:r>
+            <w:r>
+              <w:rPr>
+                <w:rFonts w:ascii="Arial" w:hAnsi="Arial" w:cs="Arial"/>
+                <w:color w:val="auto"/>
+                <w:sz w:val="20"/>
+                <w:szCs w:val="20"/>
+              </w:rPr>
               <w:t>ed</w:t>
             </w:r>
             <w:r>
@@ -4773,6 +4799,7 @@
               </w:rPr>
               <w:t>?</w:t>
             </w:r>
+            <w:proofErr w:type="gramEnd"/>
             <w:r>
               <w:rPr>
                 <w:rFonts w:ascii="Arial" w:hAnsi="Arial" w:cs="Arial"/>
@@ -4780,7 +4807,17 @@
                 <w:sz w:val="20"/>
                 <w:szCs w:val="20"/>
               </w:rPr>
-              <w:t xml:space="preserve"> CTNs, inspected carton NO.: </w:t>
+              <w:t xml:space="preserve"> CTNs, inspected carton NO.</w:t>
+            </w:r>
+            <w:proofErr w:type="gramStart"/>
+            <w:r>
+              <w:rPr>
+                <w:rFonts w:ascii="Arial" w:hAnsi="Arial" w:cs="Arial"/>
+                <w:color w:val="auto"/>
+                <w:sz w:val="20"/>
+                <w:szCs w:val="20"/>
+              </w:rPr>
+              <w:t xml:space="preserve">: </w:t>
             </w:r>
             <w:r>
               <w:rPr>
@@ -4791,6 +4828,7 @@
               </w:rPr>
               <w:t>?</w:t>
             </w:r>
+            <w:proofErr w:type="gramEnd"/>
           </w:p>
         </w:tc>
       </w:tr>
@@ -10339,7 +10377,25 @@
                 <w:sz w:val="20"/>
                 <w:lang w:val="en-US" w:eastAsia="zh-CN"/>
               </w:rPr>
-              <w:t>Carton drop test</w:t>
+              <w:t xml:space="preserve">Carton </w:t>
+            </w:r>
+            <w:proofErr w:type="gramStart"/>
+            <w:r>
+              <w:rPr>
+                <w:rFonts w:ascii="Arial" w:hAnsi="Arial" w:cs="Arial"/>
+                <w:sz w:val="20"/>
+                <w:lang w:val="en-US" w:eastAsia="zh-CN"/>
+              </w:rPr>
+              <w:t>drop</w:t>
+            </w:r>
+            <w:proofErr w:type="gramEnd"/>
+            <w:r>
+              <w:rPr>
+                <w:rFonts w:ascii="Arial" w:hAnsi="Arial" w:cs="Arial"/>
+                <w:sz w:val="20"/>
+                <w:lang w:val="en-US" w:eastAsia="zh-CN"/>
+              </w:rPr>
+              <w:t xml:space="preserve"> test</w:t>
             </w:r>
           </w:p>
         </w:tc>
@@ -11762,7 +11818,25 @@
                 <w:sz w:val="20"/>
                 <w:lang w:val="en-US" w:eastAsia="zh-CN"/>
               </w:rPr>
-              <w:t>Seam pull by hand</w:t>
+              <w:t xml:space="preserve">Seam </w:t>
+            </w:r>
+            <w:proofErr w:type="gramStart"/>
+            <w:r>
+              <w:rPr>
+                <w:rFonts w:ascii="Arial" w:hAnsi="Arial" w:cs="Arial"/>
+                <w:sz w:val="20"/>
+                <w:lang w:val="en-US" w:eastAsia="zh-CN"/>
+              </w:rPr>
+              <w:t>pull</w:t>
+            </w:r>
+            <w:proofErr w:type="gramEnd"/>
+            <w:r>
+              <w:rPr>
+                <w:rFonts w:ascii="Arial" w:hAnsi="Arial" w:cs="Arial"/>
+                <w:sz w:val="20"/>
+                <w:lang w:val="en-US" w:eastAsia="zh-CN"/>
+              </w:rPr>
+              <w:t xml:space="preserve"> by hand</w:t>
             </w:r>
           </w:p>
         </w:tc>
@@ -13567,13 +13641,23 @@
                 <w:lang w:val="en-US" w:eastAsia="zh-CN"/>
               </w:rPr>
             </w:pPr>
+            <w:proofErr w:type="gramStart"/>
             <w:r>
               <w:rPr>
                 <w:rFonts w:ascii="Arial" w:hAnsi="Arial" w:cs="Arial"/>
                 <w:sz w:val="20"/>
                 <w:lang w:val="en-US" w:eastAsia="zh-CN"/>
               </w:rPr>
-              <w:t>Other test?</w:t>
+              <w:t>Other</w:t>
+            </w:r>
+            <w:proofErr w:type="gramEnd"/>
+            <w:r>
+              <w:rPr>
+                <w:rFonts w:ascii="Arial" w:hAnsi="Arial" w:cs="Arial"/>
+                <w:sz w:val="20"/>
+                <w:lang w:val="en-US" w:eastAsia="zh-CN"/>
+              </w:rPr>
+              <w:t xml:space="preserve"> test?</w:t>
             </w:r>
           </w:p>
         </w:tc>
@@ -18353,7 +18437,25 @@
         <w:sz w:val="18"/>
         <w:lang w:eastAsia="zh-CN"/>
       </w:rPr>
-      <w:t xml:space="preserve">            </w:t>
+      <w:t xml:space="preserve">      </w:t>
+    </w:r>
+    <w:r>
+      <w:rPr>
+        <w:rFonts w:ascii="Akkurat Light Pro" w:hAnsi="Akkurat Light Pro" w:hint="eastAsia"/>
+        <w:noProof/>
+        <w:sz w:val="18"/>
+        <w:lang w:eastAsia="zh-CN"/>
+      </w:rPr>
+      <w:t xml:space="preserve">   </w:t>
+    </w:r>
+    <w:r>
+      <w:rPr>
+        <w:rFonts w:ascii="Akkurat Light Pro" w:hAnsi="Akkurat Light Pro" w:hint="eastAsia"/>
+        <w:noProof/>
+        <w:sz w:val="18"/>
+        <w:lang w:eastAsia="zh-CN"/>
+      </w:rPr>
+      <w:t xml:space="preserve">      </w:t>
     </w:r>
     <w:r>
       <w:rPr>
@@ -25058,6 +25160,7 @@
     <w:rsid w:val="00396AC6"/>
     <w:rsid w:val="003E21BE"/>
     <w:rsid w:val="0049283F"/>
+    <w:rsid w:val="004F532A"/>
     <w:rsid w:val="00527E79"/>
     <w:rsid w:val="00546AE7"/>
     <w:rsid w:val="00547260"/>
@@ -25066,6 +25169,7 @@
     <w:rsid w:val="00685600"/>
     <w:rsid w:val="00692191"/>
     <w:rsid w:val="006A0F3E"/>
+    <w:rsid w:val="006C339F"/>
     <w:rsid w:val="00761851"/>
     <w:rsid w:val="007A5DC5"/>
     <w:rsid w:val="007A796C"/>

</xml_diff>